<commit_message>
Record protected Preview evidence and remaining MFA acceptance gates
</commit_message>
<xml_diff>
--- a/docs/reports/2026-10-16-mfa-privileged-security.docx
+++ b/docs/reports/2026-10-16-mfa-privileged-security.docx
@@ -196,7 +196,7 @@
         </w:numPr>
       </w:pPr>
       <w:r>
-        <w:t>Checks: test/security-admin.test.ts, phase1-permissions.test.ts, scripts/privileged-security-db-check.mjs, security-artifact-check.mjs, web-auth-checks.mjs, web-ui-checks.mjs and package.json's security subset.</w:t>
+        <w:t>Checks: test/security-admin.test.ts, phase1-permissions.test.ts, scripts/privileged-security-db-check.mjs, security-artifact-check.mjs, security-preview-check.mjs, web-auth-checks.mjs, web-ui-checks.mjs and package.json's security subset.</w:t>
       </w:r>
     </w:p>
     <w:p>
@@ -923,6 +923,72 @@
           </w:p>
         </w:tc>
       </w:tr>
+      <w:tr>
+        <w:trPr>
+          <w:cantSplit/>
+        </w:trPr>
+        <w:tc>
+          <w:tcPr>
+            <w:tcW w:type="dxa" w:w="3300"/>
+            <w:vAlign w:val="center"/>
+          </w:tcPr>
+          <w:p>
+            <w:pPr>
+              <w:pStyle w:val="ReportTableText"/>
+            </w:pPr>
+            <w:r>
+              <w:t>Vercel source delivery</w:t>
+            </w:r>
+          </w:p>
+        </w:tc>
+        <w:tc>
+          <w:tcPr>
+            <w:tcW w:type="dxa" w:w="6060"/>
+            <w:vAlign w:val="center"/>
+          </w:tcPr>
+          <w:p>
+            <w:pPr>
+              <w:pStyle w:val="ReportTableText"/>
+            </w:pPr>
+            <w:r>
+              <w:t>Exact source 63d969d is Ready in Preview; Production remains a673637</w:t>
+            </w:r>
+          </w:p>
+        </w:tc>
+      </w:tr>
+      <w:tr>
+        <w:trPr>
+          <w:cantSplit/>
+        </w:trPr>
+        <w:tc>
+          <w:tcPr>
+            <w:tcW w:type="dxa" w:w="3300"/>
+            <w:vAlign w:val="center"/>
+          </w:tcPr>
+          <w:p>
+            <w:pPr>
+              <w:pStyle w:val="ReportTableText"/>
+            </w:pPr>
+            <w:r>
+              <w:t>Credential-free Preview probes</w:t>
+            </w:r>
+          </w:p>
+        </w:tc>
+        <w:tc>
+          <w:tcPr>
+            <w:tcW w:type="dxa" w:w="6060"/>
+            <w:vAlign w:val="center"/>
+          </w:tcPr>
+          <w:p>
+            <w:pPr>
+              <w:pStyle w:val="ReportTableText"/>
+            </w:pPr>
+            <w:r>
+              <w:t>All four BLOCKED by Vercel deployment protection; zero application passes claimed</w:t>
+            </w:r>
+          </w:p>
+        </w:tc>
+      </w:tr>
     </w:tbl>
     <w:p>
       <w:pPr>
@@ -1060,7 +1126,22 @@
     </w:p>
     <w:p>
       <w:r>
-        <w:t>Review branch: codex/phase-1-mfa-privileged-security. Source commit/push and the actual Preview URL/state are pending initial report generation. No URL or hosted MFA result will be invented. This branch is not promoted to main/Production while genuine acceptance and release gates remain open. A Ready source build does not apply either Phase 1 migration or close a security requirement.</w:t>
+        <w:t>Source commit 63d969dd0e5cc975171a40e2bb1fac2723700296 is committed and pushed on codex/phase-1-mfa-privileged-security. Independent remote-ref inspection confirms the source on GitHub. Thirty-eight reviewed files were staged explicitly; the user next-env edit remains unstaged. The final evidence commit also adds the reusable credential-free Preview probe; no application runtime source changes follow the verified source build.</w:t>
+      </w:r>
+    </w:p>
+    <w:p>
+      <w:r>
+        <w:t>Vercel's read-only deployment API confirms that exact source READY on the review branch with matching gitSource SHA, deployment dpl_33vs5fHmCkGSmGH3rFE6Up5FTzt4: https://virtual-r618zjaoz-shadowrootsec-5679.vercel.app. Production remains a6736376b09ba7c3242495ff86b4bb2eea62f20c, deployment dpl_7f4Kj1XeRy1Mf3MrQiSV9PEs7PWB. This branch is not merged/promoted to main.</w:t>
+      </w:r>
+    </w:p>
+    <w:p>
+      <w:r>
+        <w:t>At 2026-10-16T07:51:53.708Z all four credential-free probes are BLOCKED by Vercel deployment protection: login/admin/status GETs return 302 to Vercel SSO, and the status POST returns Vercel's 401 SSO JSON. The initial POST classification was corrected after checking fixed provider markers without printing the body. The probe exits 2 for blocked, not success. No application page/denial, callback, MFA, role write, secure-cookie or deployed-log result is claimed from those responses. No protection was disabled, bypass token retrieved or private cookie extracted.</w:t>
+      </w:r>
+    </w:p>
+    <w:p>
+      <w:r>
+        <w:t>The Preview resource/authentication question remains unanswered. Source delivery is verified; genuine isolated Preview acceptance is not. A Ready source build does not apply either Phase 1 migration or close a security requirement.</w:t>
       </w:r>
     </w:p>
     <w:p>
@@ -1164,7 +1245,7 @@
     </w:p>
     <w:p>
       <w:r>
-        <w:t>Word uses compact_reference_guide with memo_masthead and the existing named report overrides. Both report documents pass structural checks. Rendering was attempted for both and failed because LibreOffice is absent (WinError 2); visual pagination remains unverified. Local links, composed SQL/checksum, required evidence, OOXML and privacy checks are performed separately. Report delivery does not mean human acceptance or production readiness.</w:t>
+        <w:t>Word uses compact_reference_guide with memo_masthead and the existing named report overrides. Both report documents pass structural checks. Rendering was attempted for both and failed because LibreOffice is absent (WinError 2); visual pagination remains unverified. All 226 local links, composed SQL/checksum, required evidence, OOXML and privacy checks pass. Report delivery does not mean human acceptance or production readiness.</w:t>
       </w:r>
     </w:p>
     <w:sectPr>

</xml_diff>

<commit_message>
Verify genuine local MFA and fix native Auth security boundaries
</commit_message>
<xml_diff>
--- a/docs/reports/2026-10-16-mfa-privileged-security.docx
+++ b/docs/reports/2026-10-16-mfa-privileged-security.docx
@@ -31,12 +31,12 @@
     </w:p>
     <w:p>
       <w:r>
-        <w:t>The pre-edit inspection is preserved in the matching MFA privileged gap report. It identified Supabase Auth, existing server cookie/PKCE paths, legacy private roles and an unapplied eight-role assignment foundation. There was no genuine MFA enrollment/challenge interface or runtime privileged writer. Synthetic AAL2 fixtures and pure policy inputs were not accepted as provider evidence. No mfaEnabled/mfa_enabled authorization switch was found in application source.</w:t>
+        <w:t>The [pre-edit gap report](2026-10-16-mfa-privileged-gap-report.md) identifies Supabase Auth, server cookies/PKCE, legacy private roles and the unapplied role assignment foundation. No genuine MFA interface or runtime privileged writer existed. No mfaEnabled/mfa_enabled authorization switch was found in application source. Synthetic assurance fixtures were not accepted as genuine MFA evidence.</w:t>
       </w:r>
     </w:p>
     <w:p>
       <w:r>
-        <w:t>This review implements provider-backed MFA routes/UI and a restricted role-write boundary with local evidence. It does not establish genuine provider acceptance, isolated Preview verification or human approval. No hosted SQL/Auth/role mutation or production enablement is performed. No escrow, blockchain, payment execution or additional marketplace feature is implemented. The existing user next-env edit and supplied assets are preserved. Zero of seventeen final Phase 1 mission groups is fully accepted; Phase 1 remains PARTIAL.</w:t>
+        <w:t>Provider-backed MFA and the trusted role writer now pass real local Auth and database integration checks. Managed-cloud/browser, isolated Vercel Preview, recovery and human acceptance remain open. The visible hosted project is unchanged; Production enablement is rejected. No escrow, blockchain, payment execution or additional marketplace feature was added. The user next-env edit and supplied assets are preserved. Zero of seventeen final Phase 1 mission groups is fully accepted; Phase 1 remains PARTIAL.</w:t>
       </w:r>
     </w:p>
     <w:p>
@@ -49,27 +49,32 @@
     </w:p>
     <w:p>
       <w:r>
-        <w:t>Primary login leads administrators to the server-checked security screen. It loads actual provider factors and assurance and prompts enrollment if no verified TOTP exists. Server-only Supabase SDK calls enroll, challenge and verify the factor. The QR is held in component memory, with no localStorage/sessionStorage or application secret table. Only the QR data is returned for enrollment; the separate secret/URI and access/refresh tokens are never response fields. The QR necessarily contains the enrollment secret. Successful verification establishes the SDK's higher-assurance session through HttpOnly Secure SameSite=Lax cookies. Failed provider/audit operations do not commit pending cookies.</w:t>
+        <w:t>Primary login leads administrators to /admin/security, where the server checks identity, current roles, provider factors and assurance. Supabase TOTP enrollment, challenge and verification establish genuine AAL2. The QR stays in component memory; it necessarily contains the enrollment secret. Separate secret/URI and access/refresh tokens are never API response fields. The SSR adapter commits HttpOnly Secure SameSite=Lax session cookies only after successful provider/audit work. Invalid provider operations do not commit pending cookies.</w:t>
       </w:r>
     </w:p>
     <w:p>
       <w:r>
-        <w:t>Every request verifies the user online and the same token's claims. Critical actions also check live provider session/account/factor/AMR facts and matching recent password/TOTP times in the database. The conservative window is five minutes. Fresh role reads and server checks remain authoritative even if the browser displays an old role or assurance label. Administrator password changes use this boundary; ordinary account recovery gains no administrative authority.</w:t>
+        <w:t>Sensitive actions require online verification of the same bearer, bound issuer/user/session, live provider account/session AAL2, a verified same-user TOTP factor and matching password/TOTP AMR within five minutes. An additional signed HttpOnly Secure SameSite=Strict application cookie binds that exact session and AMR, expires within five minutes, and is issued only after application-mediated genuine verification. Missing, tampered, transferred or expired proof denies. It does not replace live provider MFA. Primary reauthentication and password, factor or logout changes clear it. Administrator password updates require this boundary; ordinary recovery gains no administrative authority.</w:t>
       </w:r>
     </w:p>
     <w:p>
       <w:r>
-        <w:t>Durable account/operation attempt counters precede provider work. Enrollment, verification and reauthentication allow five attempts per fixed five-minute bucket; other MFA operations allow ten. Provider limits remain separate. HMAC fingerprints block code reuse across challenges/sessions for five minutes without storing the code. Redacted attempt/result/failure records and in-app alerts cover repeated failures and suspicious factor changes. Raw SDK/SQL errors, passwords, codes and tokens are not logged by these paths. No external alert delivery is configured or claimed.</w:t>
+        <w:t>Durable account/operation budgets precede provider work: five verification, enrollment or reauthentication attempts per fixed five-minute bucket, ten for other MFA operations. A private stable HMAC key fingerprints submitted codes; five-minute reservations prevent reuse across challenges/sessions without storing codes. Provider limits also apply. Redacted attempts/results, repeated-failure alerts and suspicious-factor events are durable and visible in the restricted audit interface. External alert delivery/provider-direct ingestion remain open.</w:t>
       </w:r>
     </w:p>
     <w:p>
       <w:r>
-        <w:t>Discarding an unfinished unverified factor requires recent primary login; removing a verified factor requires recent MFA and another verified factor. The last verified factor cannot be disabled by the application. Recovery requests require two distinct current SUPER_ADMIN approvals and private identity review. Provider operator execution and its audit correlation remain unverified. Recovery codes are not offered by the application; no insecure substitute was added. Additional verified-factor enrollment is not exposed by this review flow.</w:t>
+        <w:t>Genuine local evidence uses digest-pinned Supabase Auth v2.197.0 and PostgreSQL 18, real HTTP, the installed SDK, the actual application gateway/controller and a restricted database login. Synthetic identities are the only accounts. All 87 checks pass, including response privacy assertions. Real primary login, AAL1 denial, QR enrollment, valid verification/AAL2, invalid and expired codes/challenges, replay prevention, limits, alerts, logout and audits pass. The encrypted provider secret has the expected aes-gcm-hkdf envelope; authenticated decryption with the private generated test key matches the original synthetic secret. Provider logs contain no generated credentials/tokens/secrets or structured six-digit code.</w:t>
       </w:r>
     </w:p>
     <w:p>
       <w:r>
-        <w:t>The installed real SDK is tested with synthetic HTTP, including QR/challenge/ verification, AAL1-to-AAL2 claims, cookies and provider rejection propagation. This is not genuine enrollment or proof that the deployed provider rejects every invalid, expired or replayed code. Provider-managed secret encryption and effective Auth policy must be confirmed privately on the isolated target; no assertion, boolean or secret-table inspection substitutes for that evidence.</w:t>
+        <w:t>This provider release rejects reuse of a challenge but accepts reuse of the same TOTP against another challenge during its time window. The application denies that reuse before contacting the provider. Direct-provider AAL2 without the application proof cannot use sensitive administration. A positive genuine protected lookup passes, preventing a broken verifier from masquerading as a successful denial. This is local evidence, not a claim about managed-cloud configuration, physical QR scanning, email delivery, browser TLS or Vercel MFA.</w:t>
+      </w:r>
+    </w:p>
+    <w:p>
+      <w:r>
+        <w:t>Unverified enrollment cancellation requires recent primary login. Verified-factor removal requires recent MFA and another verified factor; the final factor cannot be disabled through the application. Recovery records require two distinct current SUPER_ADMIN approvals plus private identity review. Actual provider operator recovery and audit correlation remain unverified. Additional verified-factor enrollment and recovery codes are not offered by this review flow.</w:t>
       </w:r>
     </w:p>
     <w:p>
@@ -82,27 +87,27 @@
     </w:p>
     <w:p>
       <w:r>
-        <w:t>The original ADMIN/SUPER_ADMIN names are reused. Four distinct specialist roles are added: SECURITY_ADMIN, FINANCE_ADMIN, DISPUTE_REVIEWER and PAYOUT_APPROVER. They receive no unrelated order/file authority from their names.</w:t>
+        <w:t>ADMIN/SUPER_ADMIN are reused; four distinct specialist roles extend the original eight: SECURITY_ADMIN, FINANCE_ADMIN, DISPUTE_REVIEWER and PAYOUT_APPROVER. Their names grant no unrelated order/file authority. One active assignment remains. Changes replace it; privilege removal restores CUSTOMER. Immutable temporary expiry is at most thirty days; SUPER_ADMIN cannot expire automatically.</w:t>
       </w:r>
     </w:p>
     <w:p>
       <w:r>
-        <w:t>The browser sends target, expected assignment, requested role, reason and optional expiry to server-only routes. It never supplies actor identity or actor authority. A current SUPER_ADMIN requests the change; a different current SUPER_ADMIN, distinct from the target, approves it; requester or approver executes within fifteen minutes. All stages require recent provider MFA and recheck live authority. Customers/vendors cannot promote themselves, ADMIN cannot grant SUPER_ADMIN, and all self changes deny. The last active SUPER_ADMIN is protected. No admin is seeded and no approval is simulated. The separated workflow needs enough distinct administrators for SUPER_ADMIN changes; private bootstrap/recovery remains open.</w:t>
+        <w:t>The browser sends only target, expected assignment, requested role, mandatory reason and optional expiry to a server-only route. Identity and actor authority come from verified server state. A current SUPER_ADMIN requests; another current SUPER_ADMIN, distinct from requester/target, approves; requester or approver executes within fifteen minutes. All stages require recent genuine assurance and fresh roles. Customers/vendors/self promotion and ADMIN granting SUPER_ADMIN deny. The last active SUPER_ADMIN is guarded. No real admin/bootstrap is seeded; synthetic fixtures and software-driven test approvals are not human approvals.</w:t>
       </w:r>
     </w:p>
     <w:p>
       <w:r>
-        <w:t>One active assignment per user remains. Granting replaces the reviewed assignment; removal restores CUSTOMER. Optional expiry is immutable and limited to thirty days. SUPER_ADMIN cannot expire automatically. Expired assignments cease to authorize the next action even with an unexpired token.</w:t>
+        <w:t>The private virtual_ink_security.command function serializes decisions with a transaction advisory lock, requires READ COMMITTED and checks expected assignment, current requester/approver, target activity and expiry. Execution atomically revokes the assignment, inserts the new grant, writes mandatory transaction audits and deletes affected provider sessions. Failure rolls those mutations back while retaining a failure event. Every later action rereads current authority.</w:t>
       </w:r>
     </w:p>
     <w:p>
       <w:r>
-        <w:t>The private command serializes decisions with a transaction advisory lock, requires READ COMMITTED, checks expected assignment/current actors and performs assignment revocation, new grant, mandatory transaction audits and deletion of affected provider sessions atomically. Failure rolls those mutations back and records a failure event. A fresh synthetic target session loses access immediately after actual SQL role removal; no stale JWT role is accepted.</w:t>
+        <w:t>The genuine local integration proves separated approval, temporary ADMIN grant, fresh-login access, expiry denial while the token remains valid, subsequent removal and immediate stale-session rejection. Successful grant/removal records include before/after roles, requester, approver, executor, reason, timestamp, correlation ID, assurance, source, expiry/outcome and redacted metadata. Failed requests are audited too. Audit events reject update/delete/truncate by ordinary application and administrator roles.</w:t>
       </w:r>
     </w:p>
     <w:p>
       <w:r>
-        <w:t>The restricted UI shows identity, current assignment/expiry, requested change, reason, risk/step-up text, explicit confirmation, separated approval/execution, result and audit references. SUPER_ADMIN is not the default selection. Sensitive security events require fresh assurance. Browser interaction/manual acceptance is still pending; React SSR checks are not that acceptance.</w:t>
+        <w:t>The restricted interface shows identity/current role, requested change, risk, reason, step-up, explicit confirmation, result and audit reference. SUPER_ADMIN is never the default. React SSR passes; full browser/manual acceptance is pending. Vendor verification, suspension, refund/release/payout mutations remain unbuilt. Their shared guard denies missing assurance and returns unavailable instead of executing an unbuilt action; no workflow acceptance is claimed for them.</w:t>
       </w:r>
     </w:p>
     <w:p>
@@ -115,32 +120,32 @@
     </w:p>
     <w:p>
       <w:r>
-        <w:t xml:space="preserve">CLI-generated migration 20261016053031_virtual_ink_privileged_security.sql combines database/phase1/security.sql and its separate security-supabase.sql adapter. SHA-256: </w:t>
+        <w:t xml:space="preserve">CLI-generated 20261016053031_virtual_ink_privileged_security.sql combines portable database/phase1/security.sql with the separate security-supabase.sql adapter. SHA-256: </w:t>
       </w:r>
       <w:r>
         <w:rPr>
           <w:rFonts w:ascii="Consolas" w:hAnsi="Consolas"/>
           <w:sz w:val="20"/>
         </w:rPr>
-        <w:t>30e582457e6502c7e79bc9fab25f912e6136015bd286e4ddbb2b2795a593a78b</w:t>
+        <w:t>249f13cbe9531049d206ec05b23071f3eb742c9a208559db5b11814b29e65cac</w:t>
       </w:r>
       <w:r>
-        <w:t>. The previous eleven migration files are unchanged. There are twelve local migrations; the visible hosted project remains at ten. Both Phase 1 migrations remain unapplied there.</w:t>
+        <w:t>. The preceding eleven migrations are unchanged. Twelve local migrations replay; the visible hosted project remains at ten. Both Phase 1 migrations are unapplied. Read-only hosted catalog/advisor checks found neither new schema and one existing INFO for an intentionally closed audit table. No hosted DDL/Auth/role writes occur.</w:t>
       </w:r>
     </w:p>
     <w:p>
       <w:r>
-        <w:t>At 07:41 UTC, read-only hosted catalog checks confirm ten migrations and neither new schema. Security advisors retain one existing RLS-without-policy INFO on an intentionally closed audit table, not a new finding from the unapplied schema.</w:t>
+        <w:t>The runtime security group has command EXECUTE only: no role-table DML, Auth access, owner membership or direct provider-broker execution. The business function owner is NOLOGIN/NOBYPASSRLS/non-superuser with narrow business rights and forced-RLS policies. Existing API/vendor/provisioner/anon/authenticated/service_role groups gain no security rights, including through permissive creator defaults.</w:t>
       </w:r>
     </w:p>
     <w:p>
       <w:r>
-        <w:t>The private security service group has EXECUTE on the command, no table DML and no function-owner membership. Its separate function owner is NOLOGIN/NOBYPASSRLS and non-superuser, with narrow business/provider column rights and forced-RLS policies. Existing API, provisioner, vendor, anon, authenticated and service_role groups receive no new security access, including permissive creator defaults. Events reject UPDATE/DELETE/TRUNCATE and are append-only for application/admin roles. Migration owners remain trusted administrators.</w:t>
+        <w:t>Real Auth RLS initially made non-owner column grants insufficient. Native Auth policies are provider-owned; read-only hosted metadata confirms this task cannot manage them. The separate fixed-search-path SECURITY DEFINER provider broker uses the existing migration administrator's native rights, returns only a subject/session boolean or deletes approved-target sessions, and checks the calling service membership. Only the restricted business owner can execute it. No Auth policy or table grant, BYPASSRLS, ownership or elevated credential is given to the runtime. Read-only hosted metadata confirms postgres already has native read/revoke rights; isolated hosted application verification is still required. Migration owners remain an explicit administrative trust boundary.</w:t>
       </w:r>
     </w:p>
     <w:p>
       <w:r>
-        <w:t>The database marker starts disabled/unconfigured. No LOGIN, password, seed account or elevated browser credential is created. Runtime startup rejects unsafe logins, owner membership, mismatched issuer/environment and shared/Production enablement. Preview requires a separate project, matching independent project binding and CA. The provider-specific session reads/deletes stay separate from portable business rules. The disposable Auth-shaped SQL fixture is never a hosted migration.</w:t>
+        <w:t>Configuration starts disabled/unbound. No LOGIN/password or account is created by the migration. Startup rejects unsafe logins, owner membership, issuer/environment mismatch, Production and known shared-project Preview enablement. Preview needs independent project binding and a verified CA. The synthetic SQL Auth fixture is never applied to Supabase.</w:t>
       </w:r>
     </w:p>
     <w:p>
@@ -184,7 +189,7 @@
         </w:numPr>
       </w:pPr>
       <w:r>
-        <w:t>Database: database/phase1/security.sql, security-supabase.sql, database/tests/security-auth-fixture.sql and the new versioned migration.</w:t>
+        <w:t>Database: database/phase1/security.sql, security-supabase.sql, database/tests/security-auth-fixture.sql and the versioned security migration.</w:t>
       </w:r>
     </w:p>
     <w:p>
@@ -196,7 +201,7 @@
         </w:numPr>
       </w:pPr>
       <w:r>
-        <w:t>Checks: test/security-admin.test.ts, phase1-permissions.test.ts, scripts/privileged-security-db-check.mjs, security-artifact-check.mjs, security-preview-check.mjs, web-auth-checks.mjs, web-ui-checks.mjs and package.json's security subset.</w:t>
+        <w:t>Checks: test/security-admin.test.ts, phase1-permissions.test.ts, scripts/genuine-mfa-local-check.mjs, privileged-security-db-check.mjs, security-artifact-check.mjs, security-preview-check.mjs, web-auth-checks.mjs, web-ui-checks.mjs and package.json's opt-in local Auth command/security subset.</w:t>
       </w:r>
     </w:p>
     <w:p>
@@ -208,12 +213,12 @@
         </w:numPr>
       </w:pPr>
       <w:r>
-        <w:t>Handover: AGENTS.md, README.md, setup/security/permission/checklist/task-board/ decision/current-report docs, phase-1-security-admin.md, the disabled environment example and matching inspection/implementation Markdown and Word reports.</w:t>
+        <w:t>Handover: AGENTS.md, README.md, current team/setup/security/task/permission/ checklist/decision docs, phase-1-security-admin.md, disabled environment example and matching inspection/implementation Markdown and Word reports.</w:t>
       </w:r>
     </w:p>
     <w:p>
       <w:r>
-        <w:t>The existing apps/web/next-env.d.ts edit remains unstaged. No dependency/lockfile, supplied asset or unrelated feature was changed. Private local verification helpers and ephemeral credentials are ignored and are not delivery artifacts.</w:t>
+        <w:t>The user apps/web/next-env.d.ts edit and untracked supplied attachments remain unstaged. No dependency/lockfile or supplied asset is modified. Ignored private test credentials/logs are not delivery artifacts.</w:t>
       </w:r>
     </w:p>
     <w:p>
@@ -221,12 +226,12 @@
         <w:pStyle w:val="Heading1"/>
       </w:pPr>
       <w:r>
-        <w:t>6. Tests executed and actual results</w:t>
+        <w:t>6. Tests executed and results</w:t>
       </w:r>
     </w:p>
     <w:p>
       <w:r>
-        <w:t>Final coverage at 07:32 UTC, 16 October 2026; private reviewed Node 24.21.0.</w:t>
+        <w:t>Measured at 11:18 UTC; final genuine run at 11:46 UTC; Node 24.21.0 reviewed baseline.</w:t>
       </w:r>
     </w:p>
     <w:tbl>
@@ -324,7 +329,7 @@
               <w:pStyle w:val="ReportTableText"/>
             </w:pPr>
             <w:r>
-              <w:t>197 pass; zero failed/skipped</w:t>
+              <w:t>198 pass; zero failed/skipped</w:t>
             </w:r>
           </w:p>
         </w:tc>
@@ -357,7 +362,7 @@
               <w:pStyle w:val="ReportTableText"/>
             </w:pPr>
             <w:r>
-              <w:t>186 pass</w:t>
+              <w:t>187 pass</w:t>
             </w:r>
           </w:p>
         </w:tc>
@@ -390,7 +395,7 @@
               <w:pStyle w:val="ReportTableText"/>
             </w:pPr>
             <w:r>
-              <w:t>Six pass; claim binding, environment isolation, input/authority denial, MFA/audit ordering and safe errors</w:t>
+              <w:t>Seven pass, including signed-proof forgery/transfer/expiry denials</w:t>
             </w:r>
           </w:p>
         </w:tc>
@@ -423,7 +428,7 @@
               <w:pStyle w:val="ReportTableText"/>
             </w:pPr>
             <w:r>
-              <w:t>Ten pass; includes restricted security panel</w:t>
+              <w:t>Ten pass</w:t>
             </w:r>
           </w:p>
         </w:tc>
@@ -442,7 +447,7 @@
               <w:pStyle w:val="ReportTableText"/>
             </w:pPr>
             <w:r>
-              <w:t>Real SDK/Next with synthetic HTTP</w:t>
+              <w:t>SDK/Next synthetic HTTP</w:t>
             </w:r>
           </w:p>
         </w:tc>
@@ -456,7 +461,7 @@
               <w:pStyle w:val="ReportTableText"/>
             </w:pPr>
             <w:r>
-              <w:t>Sixteen pass; includes TOTP and shared-provider rejection</w:t>
+              <w:t>Sixteen pass; realistic 400 KB QR and bounded oversized rejection covered</w:t>
             </w:r>
           </w:p>
         </w:tc>
@@ -522,7 +527,7 @@
               <w:pStyle w:val="ReportTableText"/>
             </w:pPr>
             <w:r>
-              <w:t>Pass; sixteen static pages, dynamic security routes included</w:t>
+              <w:t>Pass; sixteen static pages and dynamic security routes</w:t>
             </w:r>
           </w:p>
         </w:tc>
@@ -588,7 +593,7 @@
               <w:pStyle w:val="ReportTableText"/>
             </w:pPr>
             <w:r>
-              <w:t>2056/2070 = 99.3237%</w:t>
+              <w:t>2074/2088 = 99.3295%</w:t>
             </w:r>
           </w:p>
         </w:tc>
@@ -621,7 +626,7 @@
               <w:pStyle w:val="ReportTableText"/>
             </w:pPr>
             <w:r>
-              <w:t>1469/1519 = 96.7084%</w:t>
+              <w:t>1492/1542 = 96.7575%</w:t>
             </w:r>
           </w:p>
         </w:tc>
@@ -654,7 +659,7 @@
               <w:pStyle w:val="ReportTableText"/>
             </w:pPr>
             <w:r>
-              <w:t>187/190 = 98.4211%</w:t>
+              <w:t>190/193 = 98.4456%</w:t>
             </w:r>
           </w:p>
         </w:tc>
@@ -687,7 +692,7 @@
               <w:pStyle w:val="ReportTableText"/>
             </w:pPr>
             <w:r>
-              <w:t>All twelve migrations and six existing SQL suites pass</w:t>
+              <w:t>Twelve migrations and six existing SQL suites pass</w:t>
             </w:r>
           </w:p>
         </w:tc>
@@ -706,7 +711,7 @@
               <w:pStyle w:val="ReportTableText"/>
             </w:pPr>
             <w:r>
-              <w:t>Actual private command probe</w:t>
+              <w:t>SQL private command</w:t>
             </w:r>
           </w:p>
         </w:tc>
@@ -720,7 +725,7 @@
               <w:pStyle w:val="ReportTableText"/>
             </w:pPr>
             <w:r>
-              <w:t>76 counted security checks plus supporting assertions pass</w:t>
+              <w:t>77 counted checks plus supporting assertions pass</w:t>
             </w:r>
           </w:p>
         </w:tc>
@@ -739,7 +744,7 @@
               <w:pStyle w:val="ReportTableText"/>
             </w:pPr>
             <w:r>
-              <w:t>SQL lifecycle/denial evidence</w:t>
+              <w:t>SQL negatives</w:t>
             </w:r>
           </w:p>
         </w:tc>
@@ -753,7 +758,7 @@
               <w:pStyle w:val="ReportTableText"/>
             </w:pPr>
             <w:r>
-              <w:t>Dual approval, customer/vendor/ADMIN/self denial, last-super protection, expiry, missing reason, stale assignment, removal/session invalidation, atomic failure rollback, audit append-only, replay/budgets and environment/isolation denials pass</w:t>
+              <w:t>Customer/vendor/ADMIN/self denial, last-super, missing reason, expiry, stale assignment/approval, atomic revocation rollback, append-only audits, replay/budgets and environment isolation pass</w:t>
             </w:r>
           </w:p>
         </w:tc>
@@ -772,7 +777,7 @@
               <w:pStyle w:val="ReportTableText"/>
             </w:pPr>
             <w:r>
-              <w:t>Concurrency scope</w:t>
+              <w:t>Concurrency</w:t>
             </w:r>
           </w:p>
         </w:tc>
@@ -786,7 +791,7 @@
               <w:pStyle w:val="ReportTableText"/>
             </w:pPr>
             <w:r>
-              <w:t>Actual advisory-lock contention and non-READ-COMMITTED rejection pass; not a broad load/linearizability certification</w:t>
+              <w:t>Advisory-lock contention and non-READ-COMMITTED denial pass; no broad load certification</w:t>
             </w:r>
           </w:p>
         </w:tc>
@@ -805,7 +810,7 @@
               <w:pStyle w:val="ReportTableText"/>
             </w:pPr>
             <w:r>
-              <w:t>Fixture cleanup</w:t>
+              <w:t>Genuine local Auth/application</w:t>
             </w:r>
           </w:p>
         </w:tc>
@@ -819,7 +824,106 @@
               <w:pStyle w:val="ReportTableText"/>
             </w:pPr>
             <w:r>
-              <w:t>Zero users, security events and provider sessions; rollback and local instance stop pass</w:t>
+              <w:t>87 checks pass against real Auth 2.197.0, including privacy assertions</w:t>
+            </w:r>
+          </w:p>
+        </w:tc>
+      </w:tr>
+      <w:tr>
+        <w:trPr>
+          <w:cantSplit/>
+        </w:trPr>
+        <w:tc>
+          <w:tcPr>
+            <w:tcW w:type="dxa" w:w="3300"/>
+            <w:vAlign w:val="center"/>
+          </w:tcPr>
+          <w:p>
+            <w:pPr>
+              <w:pStyle w:val="ReportTableText"/>
+            </w:pPr>
+            <w:r>
+              <w:t>Local lifecycle</w:t>
+            </w:r>
+          </w:p>
+        </w:tc>
+        <w:tc>
+          <w:tcPr>
+            <w:tcW w:type="dxa" w:w="6060"/>
+            <w:vAlign w:val="center"/>
+          </w:tcPr>
+          <w:p>
+            <w:pPr>
+              <w:pStyle w:val="ReportTableText"/>
+            </w:pPr>
+            <w:r>
+              <w:t>Genuine MFA, dual approval, temporary expiry, removal, immediate native session revocation and complete audits pass</w:t>
+            </w:r>
+          </w:p>
+        </w:tc>
+      </w:tr>
+      <w:tr>
+        <w:trPr>
+          <w:cantSplit/>
+        </w:trPr>
+        <w:tc>
+          <w:tcPr>
+            <w:tcW w:type="dxa" w:w="3300"/>
+            <w:vAlign w:val="center"/>
+          </w:tcPr>
+          <w:p>
+            <w:pPr>
+              <w:pStyle w:val="ReportTableText"/>
+            </w:pPr>
+            <w:r>
+              <w:t>Native test cleanup</w:t>
+            </w:r>
+          </w:p>
+        </w:tc>
+        <w:tc>
+          <w:tcPr>
+            <w:tcW w:type="dxa" w:w="6060"/>
+            <w:vAlign w:val="center"/>
+          </w:tcPr>
+          <w:p>
+            <w:pPr>
+              <w:pStyle w:val="ReportTableText"/>
+            </w:pPr>
+            <w:r>
+              <w:t>Only task-labelled containers/volumes/network removed; cleanup passes; no hosted identity created</w:t>
+            </w:r>
+          </w:p>
+        </w:tc>
+      </w:tr>
+      <w:tr>
+        <w:trPr>
+          <w:cantSplit/>
+        </w:trPr>
+        <w:tc>
+          <w:tcPr>
+            <w:tcW w:type="dxa" w:w="3300"/>
+            <w:vAlign w:val="center"/>
+          </w:tcPr>
+          <w:p>
+            <w:pPr>
+              <w:pStyle w:val="ReportTableText"/>
+            </w:pPr>
+            <w:r>
+              <w:t>SQL fixture cleanup</w:t>
+            </w:r>
+          </w:p>
+        </w:tc>
+        <w:tc>
+          <w:tcPr>
+            <w:tcW w:type="dxa" w:w="6060"/>
+            <w:vAlign w:val="center"/>
+          </w:tcPr>
+          <w:p>
+            <w:pPr>
+              <w:pStyle w:val="ReportTableText"/>
+            </w:pPr>
+            <w:r>
+              <w:t>Zero residue and local instance stop pass</w:t>
             </w:r>
           </w:p>
         </w:tc>
@@ -852,7 +956,7 @@
               <w:pStyle w:val="ReportTableText"/>
             </w:pPr>
             <w:r>
-              <w:t>All 53 generated browser text artifacts scanned; zero server-key, privileged-key, database-URL, token or enrollment-secret pattern findings</w:t>
+              <w:t>All 53 generated browser text artifacts scanned; no server key/configuration, DB URL, token or enrollment-secret patterns</w:t>
             </w:r>
           </w:p>
         </w:tc>
@@ -871,7 +975,7 @@
               <w:pStyle w:val="ReportTableText"/>
             </w:pPr>
             <w:r>
-              <w:t>Runtime baseline / repository checks</w:t>
+              <w:t>Runtime baseline / repository heuristics</w:t>
             </w:r>
           </w:p>
         </w:tc>
@@ -918,73 +1022,7 @@
               <w:pStyle w:val="ReportTableText"/>
             </w:pPr>
             <w:r>
-              <w:t>Both zero known vulnerabilities</w:t>
-            </w:r>
-          </w:p>
-        </w:tc>
-      </w:tr>
-      <w:tr>
-        <w:trPr>
-          <w:cantSplit/>
-        </w:trPr>
-        <w:tc>
-          <w:tcPr>
-            <w:tcW w:type="dxa" w:w="3300"/>
-            <w:vAlign w:val="center"/>
-          </w:tcPr>
-          <w:p>
-            <w:pPr>
-              <w:pStyle w:val="ReportTableText"/>
-            </w:pPr>
-            <w:r>
-              <w:t>Vercel source delivery</w:t>
-            </w:r>
-          </w:p>
-        </w:tc>
-        <w:tc>
-          <w:tcPr>
-            <w:tcW w:type="dxa" w:w="6060"/>
-            <w:vAlign w:val="center"/>
-          </w:tcPr>
-          <w:p>
-            <w:pPr>
-              <w:pStyle w:val="ReportTableText"/>
-            </w:pPr>
-            <w:r>
-              <w:t>Exact source 63d969d is Ready in Preview; Production remains a673637</w:t>
-            </w:r>
-          </w:p>
-        </w:tc>
-      </w:tr>
-      <w:tr>
-        <w:trPr>
-          <w:cantSplit/>
-        </w:trPr>
-        <w:tc>
-          <w:tcPr>
-            <w:tcW w:type="dxa" w:w="3300"/>
-            <w:vAlign w:val="center"/>
-          </w:tcPr>
-          <w:p>
-            <w:pPr>
-              <w:pStyle w:val="ReportTableText"/>
-            </w:pPr>
-            <w:r>
-              <w:t>Credential-free Preview probes</w:t>
-            </w:r>
-          </w:p>
-        </w:tc>
-        <w:tc>
-          <w:tcPr>
-            <w:tcW w:type="dxa" w:w="6060"/>
-            <w:vAlign w:val="center"/>
-          </w:tcPr>
-          <w:p>
-            <w:pPr>
-              <w:pStyle w:val="ReportTableText"/>
-            </w:pPr>
-            <w:r>
-              <w:t>All four BLOCKED by Vercel deployment protection; zero application passes claimed</w:t>
+              <w:t>Zero known vulnerabilities in both scopes</w:t>
             </w:r>
           </w:p>
         </w:tc>
@@ -997,7 +1035,12 @@
     </w:p>
     <w:p>
       <w:r>
-        <w:t>Unit coverage excludes SQL, frontend/browser journeys, server lifecycle and genuine hosted integrations. SQL uses provider-shaped local tables and synthetic session facts, not real Auth signatures. SDK tests use the installed SDK but synthetic provider HTTP. No provider security test or human signoff is fabricated. Early failed regression/SQL/type checks were corrected and retested; final required local checks pass. Existing non-fatal SDK malformed-cookie/module/Three warnings remain and do not contain real secrets.</w:t>
+        <w:t>Coverage measures backend/shared units, excluding SQL, frontend/browser journeys, server lifecycle and hosted integrations. The SQL suite uses provider-shaped fixtures; the separate 87 checks use genuine provider HTTP and native Auth tables. The native harness observes only its generated synthetic authenticator secret in memory to supply valid test codes and verify encryption; it never prints it.</w:t>
+      </w:r>
+    </w:p>
+    <w:p>
+      <w:r>
+        <w:t>Initial build/provider runs hit Windows allocation failures and one restricted worker-spawn denial. Only verified task-owned containers were cleaned after the aborted process. Separate bounded-heap provider runs and a one-worker build pass. Native RLS/QR bugs were fixed and retested. Existing synthetic malformed-cookie/ module/Three warnings contain no real secrets. No required local test remains failing. None of these tests establishes managed-cloud or human acceptance.</w:t>
       </w:r>
     </w:p>
     <w:p>
@@ -1017,7 +1060,7 @@
         </w:numPr>
       </w:pPr>
       <w:r>
-        <w:t>Genuine provider registration/sign-in, TOTP QR enrollment/challenge/AAL2 and invalid/expired/replayed-code acceptance remain unverified.</w:t>
+        <w:t>An isolated non-production Supabase target, approved synthetic identities, restricted runtime credential/CA and reviewed real bootstrap are missing. The visible active project is shared and has no development branches. No billed resource is created or assumed authorized.</w:t>
       </w:r>
     </w:p>
     <w:p>
@@ -1029,7 +1072,7 @@
         </w:numPr>
       </w:pPr>
       <w:r>
-        <w:t>A confirmed isolated non-production project, approved synthetic identities, restricted runtime credential/CA and reviewed bootstrap are missing. The visible active project has no development branches. No billed resource was created.</w:t>
+        <w:t>Managed-cloud enrollment/AAL2/code denials, effective encryption/session policy, provider-direct factor/logout audits and deployed log privacy remain unverified.</w:t>
       </w:r>
     </w:p>
     <w:p>
@@ -1041,7 +1084,7 @@
         </w:numPr>
       </w:pPr>
       <w:r>
-        <w:t>Effective provider MFA secret encryption, timeout/inactivity policy, direct provider factor/logout audit coverage and deployed log redaction are unverified.</w:t>
+        <w:t>Controlled recovery records/approvals exist; private identity review, provider operator execution/audit correlation and interrupted-operation reconciliation remain unaccepted. External alert delivery/direct event ingestion is absent.</w:t>
       </w:r>
     </w:p>
     <w:p>
@@ -1053,7 +1096,7 @@
         </w:numPr>
       </w:pPr>
       <w:r>
-        <w:t>Controlled recovery approval records are implemented; actual private identity review, provider recovery execution, audit correlation and reconciliation of interrupted external operations are not accepted.</w:t>
+        <w:t>Additional verified-factor enrollment and recovery codes are not offered. The final verified factor has no application/support bypass.</w:t>
       </w:r>
     </w:p>
     <w:p>
@@ -1065,7 +1108,7 @@
         </w:numPr>
       </w:pPr>
       <w:r>
-        <w:t>Repeated failure/factor-change alerts exist in the application audit view; external alert delivery and provider-direct event ingestion are not implemented.</w:t>
+        <w:t>Vendor verification, suspension, refund/release/payout mutations remain unbuilt; shared guard tests do not establish those workflows.</w:t>
       </w:r>
     </w:p>
     <w:p>
@@ -1077,7 +1120,7 @@
         </w:numPr>
       </w:pPr>
       <w:r>
-        <w:t>Additional verified-factor enrollment and application recovery codes are not offered. The final factor cannot be disabled through the application.</w:t>
+        <w:t>Actual browser/physical authenticator, exact deployed callbacks, protected-route session/assurance and isolated Vercel resource/cookie/header/log acceptance remain pending. Vercel protection is retained. The in-app browser connection also failed before navigation because its kernel assets could not be written (OS error 3); no browser check is claimed from it.</w:t>
       </w:r>
     </w:p>
     <w:p>
@@ -1089,31 +1132,7 @@
         </w:numPr>
       </w:pPr>
       <w:r>
-        <w:t>Vendor verification, suspension, refunds, releases and payout-account mutations remain unbuilt/unavailable. Their shared guard denies missing assurance, but no claim is made that unbuilt workflows were exercised.</w:t>
-      </w:r>
-    </w:p>
-    <w:p>
-      <w:pPr>
-        <w:pStyle w:val="ReportList"/>
-        <w:numPr>
-          <w:ilvl w:val="0"/>
-          <w:numId w:val="80"/>
-        </w:numPr>
-      </w:pPr>
-      <w:r>
-        <w:t>Full Preview MFA/role interaction, real callback/resource isolation and browser acceptance are pending. Local headers/cookies and artifact checks do not prove hosted runtime logs or provider policy.</w:t>
-      </w:r>
-    </w:p>
-    <w:p>
-      <w:pPr>
-        <w:pStyle w:val="ReportList"/>
-        <w:numPr>
-          <w:ilvl w:val="0"/>
-          <w:numId w:val="80"/>
-        </w:numPr>
-      </w:pPr>
-      <w:r>
-        <w:t>The HIGH Node advisory and human/phase acceptance gates remain open.</w:t>
+        <w:t>HIGH-NODE-01 and human/phase acceptance remain open. No COMPLETE claim is made.</w:t>
       </w:r>
     </w:p>
     <w:p>
@@ -1126,22 +1145,12 @@
     </w:p>
     <w:p>
       <w:r>
-        <w:t>Source commit 63d969dd0e5cc975171a40e2bb1fac2723700296 is committed and pushed on codex/phase-1-mfa-privileged-security. Independent remote-ref inspection confirms the source on GitHub. Thirty-eight reviewed files were staged explicitly; the user next-env edit remains unstaged. The final evidence commit also adds the reusable credential-free Preview probe; no application runtime source changes follow the verified source build.</w:t>
+        <w:t>DELIVERY_PENDING_FINAL_SOURCE</w:t>
       </w:r>
     </w:p>
     <w:p>
       <w:r>
-        <w:t>Vercel's read-only deployment API confirms that exact source READY on the review branch with matching gitSource SHA, deployment dpl_33vs5fHmCkGSmGH3rFE6Up5FTzt4: https://virtual-r618zjaoz-shadowrootsec-5679.vercel.app. Production remains a6736376b09ba7c3242495ff86b4bb2eea62f20c, deployment dpl_7f4Kj1XeRy1Mf3MrQiSV9PEs7PWB. This branch is not merged/promoted to main.</w:t>
-      </w:r>
-    </w:p>
-    <w:p>
-      <w:r>
-        <w:t>At 2026-10-16T07:51:53.708Z all four credential-free probes are BLOCKED by Vercel deployment protection: login/admin/status GETs return 302 to Vercel SSO, and the status POST returns Vercel's 401 SSO JSON. The initial POST classification was corrected after checking fixed provider markers without printing the body. The probe exits 2 for blocked, not success. No application page/denial, callback, MFA, role write, secure-cookie or deployed-log result is claimed from those responses. No protection was disabled, bypass token retrieved or private cookie extracted.</w:t>
-      </w:r>
-    </w:p>
-    <w:p>
-      <w:r>
-        <w:t>The Preview resource/authentication question remains unanswered. Source delivery is verified; genuine isolated Preview acceptance is not. A Ready source build does not apply either Phase 1 migration or close a security requirement.</w:t>
+        <w:t>The previous source 63d969d was Ready at https://virtual-r618zjaoz-shadowrootsec-5679.vercel.app, deployment dpl_33vs5fHmCkGSmGH3rFE6Up5FTzt4. Its four credential-free guest probes were BLOCKED by Vercel protection, not application passes. This prior deployment does not include the native RLS/QR/signed-proof corrections. Production/main stays a6736376b09ba7c3242495ff86b4bb2eea62f20c, deployment dpl_7f4Kj1XeRy1Mf3MrQiSV9PEs7PWB. No merge/promotion or hosted migration is performed.</w:t>
       </w:r>
     </w:p>
     <w:p>
@@ -1149,37 +1158,47 @@
         <w:pStyle w:val="Heading1"/>
       </w:pPr>
       <w:r>
-        <w:t>9. Security findings and review</w:t>
+        <w:t>9. Security findings</w:t>
       </w:r>
     </w:p>
     <w:p>
       <w:r>
-        <w:t>SEC-PASSWORD-01: the existing password-update path checked a confirmed primary session only. A compromised primary session could attempt an administrator's security-setting change without app-level step-up. Synthetic inspection/tests show that existing behavior; no real account compromise is claimed. With the new boundary enabled, administrator password updates require current password/TOTP assurance and audited outcomes; actual SQL negative tests pass. Provider-direct policy still needs genuine acceptance. Ordinary recovery remains separate.</w:t>
+        <w:t>SEC-PASSWORD-01: the primary-only administrator password-update path lacked application step-up. The enabled boundary now requires recent genuine MFA, signed proof and audited results. Ordinary recovery remains separate; direct provider settings still need managed acceptance.</w:t>
       </w:r>
     </w:p>
     <w:p>
       <w:r>
-        <w:t>SEC-ROLE-01: caller-supplied authority, stale role/session facts, self promotion, unaudited writes and stale approvals are prevented by strict inputs, verified identity, fresh DB authority, separate approval, immutable expiry, serialized execution, required transaction audits and immediate session deletion. Actual SQL negative and rollback tests pass. A compromised migration owner or trusted server credential is outside ordinary-user isolation; no browser receives it.</w:t>
+        <w:t>SEC-ROLE-01: direct/self writes, client authority, stale grants/sessions and unaudited changes are denied by strict server inputs, current DB authority, distinct approval, immutable expiry and atomic audit/session revocation. Genuine grant/removal plus negative SQL checks pass. A compromised migration owner or trusted server credential remains outside ordinary-user isolation.</w:t>
       </w:r>
     </w:p>
     <w:p>
       <w:r>
-        <w:t>SEC-MFA-01: local counters and HMAC replay reservations prevent repeated provider work and code reuse; provider rejection is propagated without secrets. No local boolean substitutes for MFA. External provider changes and app audit commits are not one transaction: intent/result records support reconciliation, but a crash can leave a pending intent. Provider audit ingestion/recovery acceptance remains open, so this is not complete control coverage.</w:t>
+        <w:t>SEC-MFA-01: native Auth permits cross-challenge reuse within a TOTP window. An attacker already holding a valid factor code and primary session could try to bypass application reservations through the public provider API. Durable HMAC reservations and the session/AMR-bound signed application proof deny that route; genuine positive and negative tests pass. No claim of a hosted exploit or provider CVE is made. External Auth HTTP work and application audit commits are not one transaction; pending intent reconciliation/provider audit ingestion remain open.</w:t>
       </w:r>
     </w:p>
     <w:p>
       <w:r>
-        <w:t>HIGH-NODE-01 remains open: the [Node security announcement](https://nodejs.org/en/blog/vulnerability/october-2026-security-releases) identifies HIGH-severity fixes for 24.x scheduled for 21 October. A passing fixed baseline or zero npm audit result does not resolve it. Existing security rules block completion/promotion until patch review and retesting. No production sensitive enablement is performed.</w:t>
+        <w:t>SEC-NATIVE-RLS-01: native Auth RLS initially denied all restricted verifier reads; a denial-only fixture could hide the broken journey. The narrow native broker fixes it without runtime Auth grants; real positive lookups and role execution pass. This reproduced an availability failure, not unauthorized access.</w:t>
       </w:r>
     </w:p>
     <w:p>
       <w:r>
-        <w:t>Tool review: repository/tool output was treated as untrusted. Only synthetic loopback probes, dependency metadata and reviewed hosted catalog/project reads were used. No real Auth rows/secrets, customer/vendor evidence, private addresses, codes, signed URLs or elevated keys were printed or staged. No external-target scan, live funds, destructive hosted action or simulated human approval occurred. The SQL query's initial UUID type error and a readonly UI type mismatch were corrected; final local replay/type checks pass. These are implementation failures caught locally, not reproduced hosted exploits.</w:t>
+        <w:t>SEC-NATIVE-QR-01: the real 406 KB QR exceeded the 256 KB adapter limit and blocked enrollment. A bounded 1 MiB limit accepts real enrollment; realistic/oversized SDK regressions and genuine QR enrollment pass. No secret is added to logs/reports.</w:t>
       </w:r>
     </w:p>
     <w:p>
       <w:r>
-        <w:t>Primary sources reviewed: [Supabase MFA](https://supabase.com/docs/guides/auth/auth-mfa/totp), [rate limits](https://supabase.com/docs/guides/auth/rate-limits), [sessions](https://supabase.com/docs/guides/auth/sessions), [changelog](https://supabase.com/changelog), [Auth AMR generation](https://github.com/supabase/auth/blob/master/internal/models/sessions.go) and [provider encryption implementation](https://github.com/supabase/auth/blob/master/internal/crypto/crypto.go). Source capability is not evidence of the hosted encryption configuration.</w:t>
+        <w:t>HIGH-NODE-01 remains open: the [Node announcement](https://nodejs.org/en/blog/vulnerability/october-2026-security-releases) identifies HIGH fixes for 24.x scheduled for 21 October. Its [24.22 regular release](https://nodejs.org/en/blog/release/v24.22.0) is available but does not close that announced security gate. Tests use the reviewed 24.21 baseline, not a claim of latest-patch verification. Patch review and retesting remain required; zero npm audit does not resolve runtime issues.</w:t>
+      </w:r>
+    </w:p>
+    <w:p>
+      <w:r>
+        <w:t>Tool review: only synthetic loopback probes and reviewed hosted catalog reads were used. Local admin credentials belong only to disposable containers, never HTTP/web environments. No real hosted Auth rows, customer/vendor evidence, secrets, private addresses or tokens were printed/staged. Supplied documents/tool results were treated as untrusted. No external-target scan, live funds, hosted destructive action or simulated human approval occurred. The scope is application security, not a workstation/AI-provider/whole-production penetration test.</w:t>
+      </w:r>
+    </w:p>
+    <w:p>
+      <w:r>
+        <w:t>Primary references: [Supabase TOTP](https://supabase.com/docs/guides/auth/auth-mfa/totp), [rate limits](https://supabase.com/docs/guides/auth/rate-limits), [sessions](https://supabase.com/docs/guides/auth/sessions) and [pinned Auth encryption source](https://github.com/supabase/auth/blob/v2.197.0/internal/crypto/crypto.go). Capability/source review does not establish hosted configuration.</w:t>
       </w:r>
     </w:p>
     <w:p>
@@ -1192,7 +1211,7 @@
     </w:p>
     <w:p>
       <w:r>
-        <w:t>Uchi and Mumba must identify the isolated non-production project and approved synthetic identities, configure credentials privately and review the first two SUPER_ADMIN bootstrap records. Then follow docs/phase-1-security-admin.md to apply the reviewed migrations on that isolated target, bind the actual Preview origin/ callbacks, and execute genuine TOTP/role/negative/log acceptance. The resource question is pending; elapsed time is not authorization to reuse the shared target. Resolve HIGH-NODE-01 before completion/promotion.</w:t>
+        <w:t>Uchi and Mumba must identify the isolated non-production project and approved synthetic identities, configure credentials privately and review the first two SUPER_ADMIN bootstrap records. Then apply the reviewed migrations there, bind the actual Preview origin and exact Auth callbacks, and run the genuine browser TOTP/role/negative/log acceptance in docs/phase-1-security-admin.md. The resource question remains open; “proceed” does not identify a project or approve billing. Resolve HIGH-NODE-01 and recovery/alert gaps before completion/promotion.</w:t>
       </w:r>
     </w:p>
     <w:p>
@@ -1204,7 +1223,7 @@
         </w:numPr>
       </w:pPr>
       <w:r>
-        <w:t>Uchi: confirm isolated resources, synthetic identity approval, bootstrap and conservative policy choices; retain security and human acceptance gates.</w:t>
+        <w:t>Uchi: confirm isolated resources, synthetic identities, bootstrap and policy choices; retain security/human gates.</w:t>
       </w:r>
     </w:p>
     <w:p>
@@ -1216,7 +1235,7 @@
         </w:numPr>
       </w:pPr>
       <w:r>
-        <w:t>Mumba: pair on restricted credential/CA setup, genuine provider/Preview tests, audit/recovery reconciliation and runtime patch retesting.</w:t>
+        <w:t>Mumba: review the narrow native broker and restricted credential/CA, pair on genuine Preview checks, recovery/audit reconciliation and runtime retesting.</w:t>
       </w:r>
     </w:p>
     <w:p>
@@ -1228,7 +1247,7 @@
         </w:numPr>
       </w:pPr>
       <w:r>
-        <w:t>Taizya: review authenticator, denial, confirmation, removal and recovery states with actual browser interaction; no UX signoff is claimed.</w:t>
+        <w:t>Taizya: exercise authenticator/denial/confirmation/removal/recovery browser states. No UX signoff is claimed.</w:t>
       </w:r>
     </w:p>
     <w:p>
@@ -1240,12 +1259,12 @@
         </w:numPr>
       </w:pPr>
       <w:r>
-        <w:t>Lubasi: review identity evidence, separated reviewer/recovery operations and in-app alert response; keep actual evidence outside Git.</w:t>
+        <w:t>Lubasi: review private identity evidence, separated recovery operations and alert response; keep actual evidence outside Git.</w:t>
       </w:r>
     </w:p>
     <w:p>
       <w:r>
-        <w:t>Word uses compact_reference_guide with memo_masthead and the existing named report overrides. Both report documents pass structural checks. Rendering was attempted for both and failed because LibreOffice is absent (WinError 2); visual pagination remains unverified. All 226 local links, composed SQL/checksum, required evidence, OOXML and privacy checks pass. Report delivery does not mean human acceptance or production readiness.</w:t>
+        <w:t>Word uses compact_reference_guide/memo_masthead and existing report overrides. Structural checks pass. LibreOffice is absent; rendering was attempted and visual pagination remains unverified. Link/checksum/OOXML/privacy checks are recorded with the final delivery evidence. Report delivery is not human acceptance or readiness.</w:t>
       </w:r>
     </w:p>
     <w:sectPr>

</xml_diff>

<commit_message>
Record genuine MFA evidence and protected Preview limitations
</commit_message>
<xml_diff>
--- a/docs/reports/2026-10-16-mfa-privileged-security.docx
+++ b/docs/reports/2026-10-16-mfa-privileged-security.docx
@@ -69,7 +69,7 @@
     </w:p>
     <w:p>
       <w:r>
-        <w:t>This provider release rejects reuse of a challenge but accepts reuse of the same TOTP against another challenge during its time window. The application denies that reuse before contacting the provider. Direct-provider AAL2 without the application proof cannot use sensitive administration. A positive genuine protected lookup passes, preventing a broken verifier from masquerading as a successful denial. This is local evidence, not a claim about managed-cloud configuration, physical QR scanning, email delivery, browser TLS or Vercel MFA.</w:t>
+        <w:t>This provider release rejects reuse of a challenge but accepts reuse of the same TOTP against another challenge during its time window. The application denies reuse of codes already submitted through this application before contacting the provider. Direct-provider AAL2 without the application proof cannot use sensitive administration. A positive genuine protected lookup passes, preventing a broken verifier from masquerading as a successful denial. This is local evidence, not a claim about managed-cloud configuration, physical QR scanning, email delivery, browser TLS or Vercel MFA.</w:t>
       </w:r>
     </w:p>
     <w:p>
@@ -843,6 +843,39 @@
               <w:pStyle w:val="ReportTableText"/>
             </w:pPr>
             <w:r>
+              <w:t>Native cross-challenge reuse</w:t>
+            </w:r>
+          </w:p>
+        </w:tc>
+        <w:tc>
+          <w:tcPr>
+            <w:tcW w:type="dxa" w:w="6060"/>
+            <w:vAlign w:val="center"/>
+          </w:tcPr>
+          <w:p>
+            <w:pPr>
+              <w:pStyle w:val="ReportTableText"/>
+            </w:pPr>
+            <w:r>
+              <w:t>Provider rejection is false; this separate observed limitation remains unresolved</w:t>
+            </w:r>
+          </w:p>
+        </w:tc>
+      </w:tr>
+      <w:tr>
+        <w:trPr>
+          <w:cantSplit/>
+        </w:trPr>
+        <w:tc>
+          <w:tcPr>
+            <w:tcW w:type="dxa" w:w="3300"/>
+            <w:vAlign w:val="center"/>
+          </w:tcPr>
+          <w:p>
+            <w:pPr>
+              <w:pStyle w:val="ReportTableText"/>
+            </w:pPr>
+            <w:r>
               <w:t>Local lifecycle</w:t>
             </w:r>
           </w:p>
@@ -1040,7 +1073,7 @@
     </w:p>
     <w:p>
       <w:r>
-        <w:t>Initial build/provider runs hit Windows allocation failures and one restricted worker-spawn denial. Only verified task-owned containers were cleaned after the aborted process. Separate bounded-heap provider runs and a one-worker build pass. Native RLS/QR bugs were fixed and retested. Existing synthetic malformed-cookie/ module/Three warnings contain no real secrets. No required local test remains failing. None of these tests establishes managed-cloud or human acceptance.</w:t>
+        <w:t>Initial build/provider runs hit Windows allocation failures and one restricted worker-spawn denial. Only verified task-owned containers were cleaned after the aborted process. Separate bounded-heap provider runs and a one-worker build pass. Native RLS/QR bugs were fixed and retested. Existing synthetic malformed-cookie/ module/Three warnings contain no real secrets. The enumerated unit/SQL/application assertions pass; the separate native cross-challenge observation remains an open requirement. None of these tests establishes managed-cloud or human acceptance.</w:t>
       </w:r>
     </w:p>
     <w:p>
@@ -1073,6 +1106,18 @@
       </w:pPr>
       <w:r>
         <w:t>Managed-cloud enrollment/AAL2/code denials, effective encryption/session policy, provider-direct factor/logout audits and deployed log privacy remain unverified.</w:t>
+      </w:r>
+    </w:p>
+    <w:p>
+      <w:pPr>
+        <w:pStyle w:val="ReportList"/>
+        <w:numPr>
+          <w:ilvl w:val="0"/>
+          <w:numId w:val="80"/>
+        </w:numPr>
+      </w:pPr>
+      <w:r>
+        <w:t>Provider-wide replay rejection is incomplete: the application ledger knows codes submitted through its own verification path, not codes first used through the provider API. The signed proof blocks a provider token alone; it does not establish global provider replay enforcement. Resolve and retest this boundary.</w:t>
       </w:r>
     </w:p>
     <w:p>
@@ -1145,7 +1190,22 @@
     </w:p>
     <w:p>
       <w:r>
-        <w:t>DELIVERY_PENDING_FINAL_SOURCE</w:t>
+        <w:t>Source ef44a90df1d6437412db029678b061eb43f01b42 is committed and pushed on codex/phase-1-mfa-privileged-security. Independent remote refs confirm the branch and unchanged main. Twenty-four reviewed files were staged explicitly; the user next-env edit and supplied attachments remain unstaged. Final evidence changes only handover documents; no runtime source follows the verified source commit.</w:t>
+      </w:r>
+    </w:p>
+    <w:p>
+      <w:r>
+        <w:t>Vercel's read-only API confirms that exact source READY with matching gitSource SHA and review branch, deployment dpl_3WRKmvYKdHo3HVBRsFmTrZdbX455: https://virtual-dp8mb6t8m-shadowrootsec-5679.vercel.app.</w:t>
+      </w:r>
+    </w:p>
+    <w:p>
+      <w:r>
+        <w:t>At 2026-10-16T12:07:25.022Z all four credential-free probes are BLOCKED by Vercel deployment protection: three GETs return 302 to Vercel SSO and the status POST returns Vercel's 401. Zero application passes are claimed. No callback, MFA, role write, hosted cookie/header/log or resource isolation result follows from these responses. No protection was disabled and no bypass token/private cookie was extracted. Isolated Preview acceptance remains pending.</w:t>
+      </w:r>
+    </w:p>
+    <w:p>
+      <w:r>
+        <w:t>The private Node runtime initially exited before Vercel metadata was returned; the installed CLI runtime then succeeded for read-only metadata. Application tests remain on Node 24.21.0. Other active containers were detected, so the Docker engine was left running; only this task's labelled containers/volumes/network were removed. The in-app browser could not connect because of its kernel-asset OS error; it supplies no browser acceptance evidence.</w:t>
       </w:r>
     </w:p>
     <w:p>
@@ -1173,7 +1233,7 @@
     </w:p>
     <w:p>
       <w:r>
-        <w:t>SEC-MFA-01: native Auth permits cross-challenge reuse within a TOTP window. An attacker already holding a valid factor code and primary session could try to bypass application reservations through the public provider API. Durable HMAC reservations and the session/AMR-bound signed application proof deny that route; genuine positive and negative tests pass. No claim of a hosted exploit or provider CVE is made. External Auth HTTP work and application audit commits are not one transaction; pending intent reconciliation/provider audit ingestion remain open.</w:t>
+        <w:t>SEC-MFA-01: native Auth permits cross-challenge reuse within a TOTP window. An attacker already holding a valid factor code and primary session could try to bypass application reservations through the public provider API. Durable HMAC reservations deny application-observed reuse, and the session/AMR-bound proof denies a provider token alone; genuine positive and negative tests pass. Codes first used outside the application are not recorded in its ledger, so global provider replay compliance remains incomplete. No hosted exploit or provider CVE is claimed. External Auth HTTP work and application audit commits are not one transaction; pending intent reconciliation/provider audit ingestion remain open.</w:t>
       </w:r>
     </w:p>
     <w:p>
@@ -1211,7 +1271,7 @@
     </w:p>
     <w:p>
       <w:r>
-        <w:t>Uchi and Mumba must identify the isolated non-production project and approved synthetic identities, configure credentials privately and review the first two SUPER_ADMIN bootstrap records. Then apply the reviewed migrations there, bind the actual Preview origin and exact Auth callbacks, and run the genuine browser TOTP/role/negative/log acceptance in docs/phase-1-security-admin.md. The resource question remains open; “proceed” does not identify a project or approve billing. Resolve HIGH-NODE-01 and recovery/alert gaps before completion/promotion.</w:t>
+        <w:t>Uchi and Mumba must identify the isolated non-production project and approved synthetic identities, configure credentials privately and review the first two SUPER_ADMIN bootstrap records. Then apply the reviewed migrations there, bind the actual Preview origin and exact Auth callbacks, and run the genuine browser TOTP/role/negative/log acceptance in docs/phase-1-security-admin.md. The resource question remains open. Resolve provider-wide replay, HIGH-NODE-01 and recovery/alert gaps before completion/promotion.</w:t>
       </w:r>
     </w:p>
     <w:p>

</xml_diff>